<commit_message>
Fix issues found in independent review pass
- Rebalance quiz answer-key distribution in Ch7, 8, 9, 10, 12 guides (was mostly "b")
- Fix broken/circular cross-chapter references across Ch3, 6, 7, 8, 9, 11, 12, 15, 16, 17
- Remove residual UND/mascot references in Ch13 guide and deck
- Genericize a real accounting firm's name used in a Ch10 case study
- Correct a Carnegie misquote and mislabeled paraphrase in Ch16
- Fix minor citation misattributions (Wired author, attention-research term, MUM-effect years, Cialdini principle count)
- Rename Ch6's goodwill framework away from a textbook-specific label
- Fix a stem/answer mismatch and a syntax bug in the exam system
- Harden exam.html: obfuscate the answer key, fix a shared-computer session collision, fix a timezone bug in the instructor prefill
</commit_message>
<xml_diff>
--- a/guides/ch03-study-guide.docx
+++ b/guides/ch03-study-guide.docx
@@ -569,7 +569,7 @@
     </w:p>
     <w:p>
       <w:r>
-        <w:t>With plan and outline in hand, draft fast and forgive yourself. The draft’s only job is to exist — judging while generating stalls both (the phase separation from Figure 1 of the chapter’s process). Practical drafting habits: write the easy section first, not necessarily the opening — momentum transfers; keep the outline visible and let topic sentences come straight from it; when a wording fight breaks out, type the clumsy version, mark it [FIX], and keep moving; and never stop at the end of a section — park mid-thought so re-entry is easy tomorrow. Rudolf Flesch, whose readability research shaped plain-language practice for decades, preached the same underlying ethic: write for the reader’s ease, not the writer’s ceremony (Flesch, 1949).</w:t>
+        <w:t>With plan and outline in hand, draft fast and forgive yourself. The draft’s only job is to exist — judging while generating stalls both, which is why drafting and revising stay separate jobs, done in separate passes. Practical drafting habits: write the easy section first, not necessarily the opening — momentum transfers; keep the outline visible and let topic sentences come straight from it; when a wording fight breaks out, type the clumsy version, mark it [FIX], and keep moving; and never stop at the end of a section — park mid-thought so re-entry is easy tomorrow. Rudolf Flesch, whose readability research shaped plain-language practice for decades, preached the same underlying ethic: write for the reader’s ease, not the writer’s ceremony (Flesch, 1949).</w:t>
       </w:r>
     </w:p>
     <w:p>
@@ -791,7 +791,7 @@
         <w:t xml:space="preserve">Audit two. </w:t>
       </w:r>
       <w:r>
-        <w:t>The nominalization audit, refined: Chapter 3 taught unfreezing; here is the taxonomy. Guilty nominalizations bury the action of THIS sentence (“made a decision” → “decided”). Innocent ones name established things: “the decision” as a known object under discussion (“the decision reached Legal on Tuesday”) is a noun doing honest noun work. The test: is the action happening in this sentence, or being referred to? Unfreeze the first; keep the second.</w:t>
+        <w:t>The nominalization audit, refined: the section above taught unfreezing; here is the taxonomy. Guilty nominalizations bury the action of THIS sentence (“made a decision” → “decided”). Innocent ones name established things: “the decision” as a known object under discussion (“the decision reached Legal on Tuesday”) is a noun doing honest noun work. The test: is the action happening in this sentence, or being referred to? Unfreeze the first; keep the second.</w:t>
       </w:r>
     </w:p>
     <w:p>
@@ -826,7 +826,7 @@
     </w:p>
     <w:p>
       <w:r>
-        <w:t>Used constantly, it is confetti — and its power dies with inflation (the same economics as Chapter 3’s emphasis toolbox). Deploy it for the verdict, the turn, or the single fact everything else serves. One more document-scale habit: let white space do structural work — the gap between sections is a breath the reader needs, not wasted paper. Dense pages read as hard even when the sentences are easy; layout is part of drafting, not decoration after it.</w:t>
+        <w:t>Used constantly, it is confetti — and its power dies with inflation (the same economics covered in the emphasis toolbox later in this chapter). Deploy it for the verdict, the turn, or the single fact everything else serves. One more document-scale habit: let white space do structural work — the gap between sections is a breath the reader needs, not wasted paper. Dense pages read as hard even when the sentences are easy; layout is part of drafting, not decoration after it.</w:t>
       </w:r>
     </w:p>
     <w:p>

</xml_diff>